<commit_message>
Outcome of project work A 4/9/2026
</commit_message>
<xml_diff>
--- a/Assignment 6B Readme Summary.docx
+++ b/Assignment 6B Readme Summary.docx
@@ -25,7 +25,23 @@
         <w:jc w:val="both"/>
       </w:pPr>
       <w:r>
-        <w:t>As my project repository already include 4 iterations (out of 6 planned iterations)&lt; I tried to optimize each iteration function for main parameter:</w:t>
+        <w:t xml:space="preserve">As my project repository already </w:t>
+      </w:r>
+      <w:proofErr w:type="gramStart"/>
+      <w:r>
+        <w:t>include</w:t>
+      </w:r>
+      <w:proofErr w:type="gramEnd"/>
+      <w:r>
+        <w:t xml:space="preserve"> 4 iterations (out of 6 planned </w:t>
+      </w:r>
+      <w:proofErr w:type="gramStart"/>
+      <w:r>
+        <w:t>iterations)&lt;</w:t>
+      </w:r>
+      <w:proofErr w:type="gramEnd"/>
+      <w:r>
+        <w:t xml:space="preserve"> I tried to optimize each iteration function for main parameter:</w:t>
       </w:r>
     </w:p>
     <w:p>
@@ -40,15 +56,87 @@
         <w:t>For iteration 1</w:t>
       </w:r>
       <w:r>
-        <w:t>, the function of ‘ReadNClean’, I asked the Visual Studio Copilot chatbot to optimize the function so its performance is improved. Before I kept the modified code I asked for an explanation what is different in the new modified code than the original code. The reply was that instead of calling a clean up function that remove the footer text when the footer only has a single page number and then calling again a function that removes the footer when it contains some words in addition to the page number (such as ‘page #’), so instead of calling each function separately, it does that clean up operation in a single call, which makes the code do the job more efficiently and calls An external function fewer times.</w:t>
-      </w:r>
-    </w:p>
-    <w:p>
-      <w:pPr>
-        <w:jc w:val="both"/>
-      </w:pPr>
-      <w:r>
-        <w:t>As for the CLEAR check, the explanation of the modfications sounded very logical. I kept asking the AI is the outcome of the modified code is the same as the old code. The answer included explanation that the results and outcome are similar. The original code was more for novice developer and took care of each case separately , while the modified code takes care of both cases in one call. As for readability, both codes are similarly readable. I decided to accept the modification and kept the modified code.</w:t>
+        <w:t>, the function of ‘</w:t>
+      </w:r>
+      <w:proofErr w:type="spellStart"/>
+      <w:r>
+        <w:t>ReadNClean</w:t>
+      </w:r>
+      <w:proofErr w:type="spellEnd"/>
+      <w:r>
+        <w:t xml:space="preserve">’, I asked the Visual Studio Copilot chatbot to optimize the </w:t>
+      </w:r>
+      <w:proofErr w:type="gramStart"/>
+      <w:r>
+        <w:t>function</w:t>
+      </w:r>
+      <w:proofErr w:type="gramEnd"/>
+      <w:r>
+        <w:t xml:space="preserve"> so its performance is improved. Before I kept the modified code I asked for an </w:t>
+      </w:r>
+      <w:proofErr w:type="gramStart"/>
+      <w:r>
+        <w:t>explanation</w:t>
+      </w:r>
+      <w:proofErr w:type="gramEnd"/>
+      <w:r>
+        <w:t xml:space="preserve"> what is different in the new modified code than the original code. The reply was that instead of calling a </w:t>
+      </w:r>
+      <w:proofErr w:type="spellStart"/>
+      <w:r>
+        <w:t>clean up</w:t>
+      </w:r>
+      <w:proofErr w:type="spellEnd"/>
+      <w:r>
+        <w:t xml:space="preserve"> function that remove the footer text when the footer only has a single page number and then calling again a function that removes the footer when it contains some words in addition to the page number (such as ‘page #’), so instead of calling each function separately, it does that </w:t>
+      </w:r>
+      <w:proofErr w:type="spellStart"/>
+      <w:r>
+        <w:t>clean up</w:t>
+      </w:r>
+      <w:proofErr w:type="spellEnd"/>
+      <w:r>
+        <w:t xml:space="preserve"> operation in a single call, which makes the code do the job more efficiently and calls An external function fewer times.</w:t>
+      </w:r>
+    </w:p>
+    <w:p>
+      <w:pPr>
+        <w:jc w:val="both"/>
+      </w:pPr>
+      <w:r>
+        <w:t xml:space="preserve">As for the CLEAR check, the explanation of the </w:t>
+      </w:r>
+      <w:proofErr w:type="spellStart"/>
+      <w:r>
+        <w:t>modfications</w:t>
+      </w:r>
+      <w:proofErr w:type="spellEnd"/>
+      <w:r>
+        <w:t xml:space="preserve"> sounded very logical. I kept </w:t>
+      </w:r>
+      <w:proofErr w:type="gramStart"/>
+      <w:r>
+        <w:t>asking</w:t>
+      </w:r>
+      <w:proofErr w:type="gramEnd"/>
+      <w:r>
+        <w:t xml:space="preserve"> the AI is the outcome of the modified code is the same as the old code. The answer included explanation that the results and outcome are similar. The original code was more for novice </w:t>
+      </w:r>
+      <w:proofErr w:type="gramStart"/>
+      <w:r>
+        <w:t>developer</w:t>
+      </w:r>
+      <w:proofErr w:type="gramEnd"/>
+      <w:r>
+        <w:t xml:space="preserve"> and took care of each case </w:t>
+      </w:r>
+      <w:proofErr w:type="gramStart"/>
+      <w:r>
+        <w:t>separately ,</w:t>
+      </w:r>
+      <w:proofErr w:type="gramEnd"/>
+      <w:r>
+        <w:t xml:space="preserve"> while the modified code takes care of both cases in one call. As for readability, both codes are similarly readable. I decided to accept the modification and kept the modified code.</w:t>
       </w:r>
     </w:p>
     <w:p>
@@ -66,15 +154,27 @@
         <w:t>,</w:t>
       </w:r>
       <w:r>
-        <w:t xml:space="preserve"> function ‘TxtExtract function’, I requested the AI to optimize the function for readability.</w:t>
-      </w:r>
-    </w:p>
-    <w:p>
-      <w:pPr>
-        <w:jc w:val="both"/>
-      </w:pPr>
-      <w:r>
-        <w:t xml:space="preserve">The explanation of the modification was that the new modified code </w:t>
+        <w:t xml:space="preserve"> function ‘</w:t>
+      </w:r>
+      <w:proofErr w:type="spellStart"/>
+      <w:r>
+        <w:t>TxtExtract</w:t>
+      </w:r>
+      <w:proofErr w:type="spellEnd"/>
+      <w:r>
+        <w:t xml:space="preserve"> function’, I requested the AI to optimize the function for readability.</w:t>
+      </w:r>
+    </w:p>
+    <w:p>
+      <w:pPr>
+        <w:jc w:val="both"/>
+      </w:pPr>
+      <w:r>
+        <w:t xml:space="preserve">The explanation of the modification was that the new modified </w:t>
+      </w:r>
+      <w:proofErr w:type="gramStart"/>
+      <w:r>
+        <w:t xml:space="preserve">code </w:t>
       </w:r>
       <w:r>
         <w:t xml:space="preserve"> r</w:t>
@@ -88,6 +188,7 @@
       <w:r>
         <w:t>ces</w:t>
       </w:r>
+      <w:proofErr w:type="gramEnd"/>
       <w:r>
         <w:t xml:space="preserve"> ambiguity, helps </w:t>
       </w:r>
@@ -111,16 +212,48 @@
         <w:jc w:val="both"/>
       </w:pPr>
       <w:r>
-        <w:t>The third iteration, the txtsearch</w:t>
-      </w:r>
-      <w:r>
-        <w:t xml:space="preserve">_navigate </w:t>
-      </w:r>
-      <w:r>
-        <w:t xml:space="preserve"> function,</w:t>
-      </w:r>
-      <w:r>
-        <w:t xml:space="preserve"> I prompt the VS Copilot to optimize it for maintainabilaity. This timwe I found the result the most successful.</w:t>
+        <w:t xml:space="preserve">The third iteration, the </w:t>
+      </w:r>
+      <w:proofErr w:type="spellStart"/>
+      <w:r>
+        <w:t>txtsearch</w:t>
+      </w:r>
+      <w:r>
+        <w:t>_</w:t>
+      </w:r>
+      <w:proofErr w:type="gramStart"/>
+      <w:r>
+        <w:t>navigate</w:t>
+      </w:r>
+      <w:proofErr w:type="spellEnd"/>
+      <w:r>
+        <w:t xml:space="preserve"> </w:t>
+      </w:r>
+      <w:r>
+        <w:t xml:space="preserve"> function</w:t>
+      </w:r>
+      <w:proofErr w:type="gramEnd"/>
+      <w:r>
+        <w:t>,</w:t>
+      </w:r>
+      <w:r>
+        <w:t xml:space="preserve"> I prompt the VS Copilot to optimize it for </w:t>
+      </w:r>
+      <w:proofErr w:type="spellStart"/>
+      <w:r>
+        <w:t>maintainabilaity</w:t>
+      </w:r>
+      <w:proofErr w:type="spellEnd"/>
+      <w:r>
+        <w:t xml:space="preserve">. This </w:t>
+      </w:r>
+      <w:proofErr w:type="spellStart"/>
+      <w:r>
+        <w:t>timwe</w:t>
+      </w:r>
+      <w:proofErr w:type="spellEnd"/>
+      <w:r>
+        <w:t xml:space="preserve"> I found the result the most successful.</w:t>
       </w:r>
     </w:p>
     <w:p>
@@ -137,7 +270,19 @@
         <w:t>ed”</w:t>
       </w:r>
       <w:r>
-        <w:t xml:space="preserve"> the `txtsearch_navigate` function for better maintainability</w:t>
+        <w:t xml:space="preserve"> the `</w:t>
+      </w:r>
+      <w:proofErr w:type="spellStart"/>
+      <w:r>
+        <w:t>txtsearch_navigate</w:t>
+      </w:r>
+      <w:proofErr w:type="spellEnd"/>
+      <w:r>
+        <w:t xml:space="preserve">` function for better </w:t>
+      </w:r>
+      <w:proofErr w:type="gramStart"/>
+      <w:r>
+        <w:t>maintainability</w:t>
       </w:r>
       <w:r>
         <w:t xml:space="preserve">, </w:t>
@@ -146,10 +291,22 @@
         <w:t xml:space="preserve"> </w:t>
       </w:r>
       <w:r>
-        <w:t>with the following</w:t>
-      </w:r>
-      <w:r>
-        <w:t xml:space="preserve">  key improvements:</w:t>
+        <w:t>with</w:t>
+      </w:r>
+      <w:proofErr w:type="gramEnd"/>
+      <w:r>
+        <w:t xml:space="preserve"> the </w:t>
+      </w:r>
+      <w:proofErr w:type="gramStart"/>
+      <w:r>
+        <w:t>following</w:t>
+      </w:r>
+      <w:r>
+        <w:t xml:space="preserve">  key</w:t>
+      </w:r>
+      <w:proofErr w:type="gramEnd"/>
+      <w:r>
+        <w:t xml:space="preserve"> improvements:</w:t>
       </w:r>
     </w:p>
     <w:p>
@@ -257,8 +414,13 @@
         <w:t>A</w:t>
       </w:r>
       <w:r>
-        <w:t xml:space="preserve"> validation helper** for cleaner input checks</w:t>
-      </w:r>
+        <w:t xml:space="preserve"> validation helper** for cleaner input </w:t>
+      </w:r>
+      <w:proofErr w:type="gramStart"/>
+      <w:r>
+        <w:t>checks</w:t>
+      </w:r>
+      <w:proofErr w:type="gramEnd"/>
     </w:p>
     <w:p>
       <w:pPr>
@@ -316,7 +478,15 @@
         <w:jc w:val="both"/>
       </w:pPr>
       <w:r>
-        <w:t>I accepted the modifications and saved the new fuction Python file.</w:t>
+        <w:t xml:space="preserve">I accepted the modifications and saved the new </w:t>
+      </w:r>
+      <w:proofErr w:type="spellStart"/>
+      <w:r>
+        <w:t>fuction</w:t>
+      </w:r>
+      <w:proofErr w:type="spellEnd"/>
+      <w:r>
+        <w:t xml:space="preserve"> Python file.</w:t>
       </w:r>
     </w:p>
     <w:p>
@@ -331,28 +501,52 @@
         <w:t>For the fourth Iteration</w:t>
       </w:r>
       <w:r>
-        <w:t>, the DocMap.py function, I asked the VS Copilot to optimized for maintainability and performance, as I noticed from the previous optimizations that these are the most efficient areas for improvements.</w:t>
-      </w:r>
-    </w:p>
-    <w:p>
-      <w:pPr>
-        <w:jc w:val="both"/>
-      </w:pPr>
-      <w:r>
-        <w:t>This was the explanation I received for the modification the VS Copilot mades:</w:t>
-      </w:r>
-    </w:p>
-    <w:p>
-      <w:pPr>
-        <w:jc w:val="both"/>
-      </w:pPr>
-    </w:p>
-    <w:p>
-      <w:pPr>
-        <w:jc w:val="both"/>
-      </w:pPr>
-      <w:r>
-        <w:t>1. **Modularization (Improved Maintainability)**</w:t>
+        <w:t xml:space="preserve">, the DocMap.py function, I asked the VS Copilot to </w:t>
+      </w:r>
+      <w:proofErr w:type="gramStart"/>
+      <w:r>
+        <w:t>optimized</w:t>
+      </w:r>
+      <w:proofErr w:type="gramEnd"/>
+      <w:r>
+        <w:t xml:space="preserve"> for maintainability and performance, as I noticed from the previous optimizations that these are the most efficient areas for improvements.</w:t>
+      </w:r>
+    </w:p>
+    <w:p>
+      <w:pPr>
+        <w:jc w:val="both"/>
+      </w:pPr>
+      <w:r>
+        <w:t xml:space="preserve">This was the explanation I received for the modification the VS Copilot </w:t>
+      </w:r>
+      <w:proofErr w:type="spellStart"/>
+      <w:r>
+        <w:t>mades</w:t>
+      </w:r>
+      <w:proofErr w:type="spellEnd"/>
+      <w:r>
+        <w:t>:</w:t>
+      </w:r>
+    </w:p>
+    <w:p>
+      <w:pPr>
+        <w:jc w:val="both"/>
+      </w:pPr>
+    </w:p>
+    <w:p>
+      <w:pPr>
+        <w:jc w:val="both"/>
+      </w:pPr>
+      <w:r>
+        <w:t xml:space="preserve">1. **Modularization (Improved </w:t>
+      </w:r>
+      <w:proofErr w:type="gramStart"/>
+      <w:r>
+        <w:t>Maintainability)*</w:t>
+      </w:r>
+      <w:proofErr w:type="gramEnd"/>
+      <w:r>
+        <w:t>*</w:t>
       </w:r>
     </w:p>
     <w:p>
@@ -368,23 +562,71 @@
         <w:jc w:val="both"/>
       </w:pPr>
       <w:r>
-        <w:t xml:space="preserve">     - `_detect_headings(lines)`: Handles heading detection logic.</w:t>
-      </w:r>
-    </w:p>
-    <w:p>
-      <w:pPr>
-        <w:jc w:val="both"/>
-      </w:pPr>
-      <w:r>
-        <w:t xml:space="preserve">     - `_handle_no_headings(text)`: Manages the case when no headings are found.</w:t>
-      </w:r>
-    </w:p>
-    <w:p>
-      <w:pPr>
-        <w:jc w:val="both"/>
-      </w:pPr>
-      <w:r>
-        <w:t xml:space="preserve">     - `_build_sections(lines, headings)`: Builds the sections list with content, summaries, and indices.</w:t>
+        <w:t xml:space="preserve">     - `_</w:t>
+      </w:r>
+      <w:proofErr w:type="spellStart"/>
+      <w:r>
+        <w:t>detect_headings</w:t>
+      </w:r>
+      <w:proofErr w:type="spellEnd"/>
+      <w:r>
+        <w:t xml:space="preserve">(lines)`: Handles </w:t>
+      </w:r>
+      <w:proofErr w:type="gramStart"/>
+      <w:r>
+        <w:t>heading</w:t>
+      </w:r>
+      <w:proofErr w:type="gramEnd"/>
+      <w:r>
+        <w:t xml:space="preserve"> detection logic.</w:t>
+      </w:r>
+    </w:p>
+    <w:p>
+      <w:pPr>
+        <w:jc w:val="both"/>
+      </w:pPr>
+      <w:r>
+        <w:t xml:space="preserve">     - `_</w:t>
+      </w:r>
+      <w:proofErr w:type="spellStart"/>
+      <w:r>
+        <w:t>handle_no_headings</w:t>
+      </w:r>
+      <w:proofErr w:type="spellEnd"/>
+      <w:r>
+        <w:t>(text)`: Manages the case when no headings are found.</w:t>
+      </w:r>
+    </w:p>
+    <w:p>
+      <w:pPr>
+        <w:jc w:val="both"/>
+      </w:pPr>
+      <w:r>
+        <w:t xml:space="preserve">     - `_</w:t>
+      </w:r>
+      <w:proofErr w:type="spellStart"/>
+      <w:r>
+        <w:t>build_</w:t>
+      </w:r>
+      <w:proofErr w:type="gramStart"/>
+      <w:r>
+        <w:t>sections</w:t>
+      </w:r>
+      <w:proofErr w:type="spellEnd"/>
+      <w:r>
+        <w:t>(</w:t>
+      </w:r>
+      <w:proofErr w:type="gramEnd"/>
+      <w:r>
+        <w:t xml:space="preserve">lines, </w:t>
+      </w:r>
+      <w:proofErr w:type="gramStart"/>
+      <w:r>
+        <w:t>headings)`</w:t>
+      </w:r>
+      <w:proofErr w:type="gramEnd"/>
+      <w:r>
+        <w:t>: Builds the sections list with content, summaries, and indices.</w:t>
       </w:r>
     </w:p>
     <w:p>
@@ -393,7 +635,31 @@
       </w:pPr>
       <w:r>
         <w:lastRenderedPageBreak/>
-        <w:t xml:space="preserve">     - `_create_mini_summary(section_text)`: Generates mini-summaries (extracted to eliminate duplication).</w:t>
+        <w:t xml:space="preserve">     - `_</w:t>
+      </w:r>
+      <w:proofErr w:type="spellStart"/>
+      <w:r>
+        <w:t>create_mini_summary</w:t>
+      </w:r>
+      <w:proofErr w:type="spellEnd"/>
+      <w:r>
+        <w:t>(</w:t>
+      </w:r>
+      <w:proofErr w:type="spellStart"/>
+      <w:r>
+        <w:t>section_</w:t>
+      </w:r>
+      <w:proofErr w:type="gramStart"/>
+      <w:r>
+        <w:t>text</w:t>
+      </w:r>
+      <w:proofErr w:type="spellEnd"/>
+      <w:r>
+        <w:t>)`</w:t>
+      </w:r>
+      <w:proofErr w:type="gramEnd"/>
+      <w:r>
+        <w:t>: Generates mini-summaries (extracted to eliminate duplication).</w:t>
       </w:r>
     </w:p>
     <w:p>
@@ -422,7 +688,23 @@
         <w:jc w:val="both"/>
       </w:pPr>
       <w:r>
-        <w:t xml:space="preserve">  The mini-summary creation logic (splitting into sentences and taking the first 1-2) was repeated in multiple places. I extracted it into `_create_mini_summary()`.</w:t>
+        <w:t xml:space="preserve">  The mini-summary creation logic (splitting into sentences and taking the first 1-2) was repeated in multiple places. I extracted it into `_</w:t>
+      </w:r>
+      <w:proofErr w:type="spellStart"/>
+      <w:r>
+        <w:t>create_mini_</w:t>
+      </w:r>
+      <w:proofErr w:type="gramStart"/>
+      <w:r>
+        <w:t>summary</w:t>
+      </w:r>
+      <w:proofErr w:type="spellEnd"/>
+      <w:r>
+        <w:t>(</w:t>
+      </w:r>
+      <w:proofErr w:type="gramEnd"/>
+      <w:r>
+        <w:t>)`.</w:t>
       </w:r>
     </w:p>
     <w:p>
@@ -449,7 +731,15 @@
         <w:jc w:val="both"/>
       </w:pPr>
       <w:r>
-        <w:t>3. **Introduction of Constants (Improved Maintainability)**</w:t>
+        <w:t xml:space="preserve">3. **Introduction of Constants (Improved </w:t>
+      </w:r>
+      <w:proofErr w:type="gramStart"/>
+      <w:r>
+        <w:t>Maintainability)*</w:t>
+      </w:r>
+      <w:proofErr w:type="gramEnd"/>
+      <w:r>
+        <w:t>*</w:t>
       </w:r>
     </w:p>
     <w:p>
@@ -486,13 +776,29 @@
         <w:jc w:val="both"/>
       </w:pPr>
       <w:r>
-        <w:t xml:space="preserve">    Instead of repeatedly joining lines to compute `start_index, </w:t>
+        <w:t xml:space="preserve">    Instead of repeatedly joining lines to compute `</w:t>
+      </w:r>
+      <w:proofErr w:type="spellStart"/>
+      <w:r>
+        <w:t>start_index</w:t>
+      </w:r>
+      <w:proofErr w:type="spellEnd"/>
+      <w:r>
+        <w:t xml:space="preserve">, </w:t>
       </w:r>
       <w:r>
         <w:t>this modification</w:t>
       </w:r>
       <w:r>
-        <w:t xml:space="preserve"> introduced a `cumulative_length` variable that tracks the running total of character positions as sections are built.</w:t>
+        <w:t xml:space="preserve"> introduced a `</w:t>
+      </w:r>
+      <w:proofErr w:type="spellStart"/>
+      <w:r>
+        <w:t>cumulative_length</w:t>
+      </w:r>
+      <w:proofErr w:type="spellEnd"/>
+      <w:r>
+        <w:t>` variable that tracks the running total of character positions as sections are built.</w:t>
       </w:r>
     </w:p>
     <w:p>
@@ -521,7 +827,15 @@
         <w:jc w:val="both"/>
       </w:pPr>
       <w:r>
-        <w:t>5. **Enhanced Type Hints and Documentation (Improved Maintainability)**</w:t>
+        <w:t xml:space="preserve">5. **Enhanced Type Hints and Documentation (Improved </w:t>
+      </w:r>
+      <w:proofErr w:type="gramStart"/>
+      <w:r>
+        <w:t>Maintainability)*</w:t>
+      </w:r>
+      <w:proofErr w:type="gramEnd"/>
+      <w:r>
+        <w:t>*</w:t>
       </w:r>
     </w:p>
     <w:p>
@@ -530,7 +844,23 @@
       </w:pPr>
       <w:r>
         <w:lastRenderedPageBreak/>
-        <w:t xml:space="preserve">  Added type hints for function parameters and return types (e.g., `List[Tuple[int, str]]` for headings). Added docstrings to all helper functions explaining their purpose and parameters.</w:t>
+        <w:t xml:space="preserve">  Added type hints for function parameters and return types (e.g., `</w:t>
+      </w:r>
+      <w:proofErr w:type="gramStart"/>
+      <w:r>
+        <w:t>List[Tuple[</w:t>
+      </w:r>
+      <w:proofErr w:type="gramEnd"/>
+      <w:r>
+        <w:t>int, str</w:t>
+      </w:r>
+      <w:proofErr w:type="gramStart"/>
+      <w:r>
+        <w:t>]]`</w:t>
+      </w:r>
+      <w:proofErr w:type="gramEnd"/>
+      <w:r>
+        <w:t xml:space="preserve"> for headings). Added docstrings to all helper functions explaining their purpose and parameters.</w:t>
       </w:r>
     </w:p>
     <w:p>
@@ -588,7 +918,15 @@
         <w:jc w:val="both"/>
       </w:pPr>
       <w:r>
-        <w:t>- **Maintainability**: The code is now more modular, readable, and easier to extend or refactor. It's less prone to bugs from duplication.</w:t>
+        <w:t>- **</w:t>
+      </w:r>
+      <w:proofErr w:type="gramStart"/>
+      <w:r>
+        <w:t>Maintainability**</w:t>
+      </w:r>
+      <w:proofErr w:type="gramEnd"/>
+      <w:r>
+        <w:t>: The code is now more modular, readable, and easier to extend or refactor. It's less prone to bugs from duplication.</w:t>
       </w:r>
     </w:p>
     <w:p>
@@ -620,10 +958,42 @@
         <w:t xml:space="preserve">As I found this modified code </w:t>
       </w:r>
       <w:r>
-        <w:t>correct, logical and also appropriate, I accepted the modification</w:t>
-      </w:r>
-      <w:r>
-        <w:t>s og thid optimization .All the updated files are now on the depository.</w:t>
+        <w:t xml:space="preserve">correct, logical </w:t>
+      </w:r>
+      <w:proofErr w:type="gramStart"/>
+      <w:r>
+        <w:t>and also</w:t>
+      </w:r>
+      <w:proofErr w:type="gramEnd"/>
+      <w:r>
+        <w:t xml:space="preserve"> appropriate, I accepted the modification</w:t>
+      </w:r>
+      <w:r>
+        <w:t xml:space="preserve">s </w:t>
+      </w:r>
+      <w:proofErr w:type="spellStart"/>
+      <w:r>
+        <w:t>og</w:t>
+      </w:r>
+      <w:proofErr w:type="spellEnd"/>
+      <w:r>
+        <w:t xml:space="preserve"> </w:t>
+      </w:r>
+      <w:proofErr w:type="spellStart"/>
+      <w:r>
+        <w:t>thid</w:t>
+      </w:r>
+      <w:proofErr w:type="spellEnd"/>
+      <w:r>
+        <w:t xml:space="preserve"> </w:t>
+      </w:r>
+      <w:proofErr w:type="gramStart"/>
+      <w:r>
+        <w:t>optimization .All</w:t>
+      </w:r>
+      <w:proofErr w:type="gramEnd"/>
+      <w:r>
+        <w:t xml:space="preserve"> the updated files are now on the depository.</w:t>
       </w:r>
     </w:p>
     <w:sectPr>

</xml_diff>